<commit_message>
Add 15 October 2026 publications, reading editions, new routes, navigation and footer
Co-authored-by: Cursor <cursoragent@cursor.com>
</commit_message>
<xml_diff>
--- a/public/founding-charter.docx
+++ b/public/founding-charter.docx
@@ -6,8 +6,8 @@
       <w:r>
         <w:drawing>
           <wp:inline xmlns:a="http://schemas.openxmlformats.org/drawingml/2006/main" xmlns:pic="http://schemas.openxmlformats.org/drawingml/2006/picture">
-            <wp:extent cx="731520" cy="731520"/>
-            <wp:docPr id="1" name="Picture 1"/>
+            <wp:extent cx="658368" cy="658368"/>
+            <wp:docPr id="1" name="Picture 1" descr="Original University of Jasper crest designed by Vincent Zhang"/>
             <wp:cNvGraphicFramePr>
               <a:graphicFrameLocks noChangeAspect="1"/>
             </wp:cNvGraphicFramePr>
@@ -27,7 +27,7 @@
                   <pic:spPr>
                     <a:xfrm>
                       <a:off x="0" y="0"/>
-                      <a:ext cx="731520" cy="731520"/>
+                      <a:ext cx="658368" cy="658368"/>
                     </a:xfrm>
                     <a:prstGeom prst="rect"/>
                   </pic:spPr>
@@ -63,8 +63,8 @@
       <w:r>
         <w:drawing>
           <wp:inline xmlns:a="http://schemas.openxmlformats.org/drawingml/2006/main" xmlns:pic="http://schemas.openxmlformats.org/drawingml/2006/picture">
-            <wp:extent cx="6217920" cy="2011680"/>
-            <wp:docPr id="2" name="Picture 2"/>
+            <wp:extent cx="6217920" cy="1965960"/>
+            <wp:docPr id="2" name="Picture 2" descr="Morning at Spirit Island by Sergey Pesterev, CC BY-SA 4.0. Landscape context only."/>
             <wp:cNvGraphicFramePr>
               <a:graphicFrameLocks noChangeAspect="1"/>
             </wp:cNvGraphicFramePr>
@@ -77,7 +77,7 @@
                   </pic:nvPicPr>
                   <pic:blipFill>
                     <a:blip r:embed="rId10"/>
-                    <a:srcRect t="25757" b="25757"/>
+                    <a:srcRect t="26349" b="26349"/>
                     <a:stretch>
                       <a:fillRect/>
                     </a:stretch>
@@ -85,7 +85,7 @@
                   <pic:spPr>
                     <a:xfrm>
                       <a:off x="0" y="0"/>
-                      <a:ext cx="6217920" cy="2011680"/>
+                      <a:ext cx="6217920" cy="1965960"/>
                     </a:xfrm>
                     <a:prstGeom prst="rect"/>
                   </pic:spPr>
@@ -115,7 +115,7 @@
           <w:color w:val="526879"/>
           <w:sz w:val="18"/>
         </w:rPr>
-        <w:t>Fearless in learning. Lead by example. One University → One Family.</w:t>
+        <w:t>Strong in body. Free in mind.  |  One University → One Family</w:t>
       </w:r>
     </w:p>
     <w:p>
@@ -124,7 +124,7 @@
           <w:color w:val="526879"/>
           <w:sz w:val="18"/>
         </w:rPr>
-        <w:t>University of Jasper is a founding project in Jasper, Alberta, Canada. Its first proposed programme is non-degree. University authorisation, accreditation, charitable status, a venue and launch dates are not established.</w:t>
+        <w:t>University of Jasper is a founding project in Jasper, Alberta, Canada. Its first proposed program is non-degree. No degree-granting authority or current institutional approval is claimed. A venue, teaching appointments, funding and launch dates remain unconfirmed.</w:t>
       </w:r>
     </w:p>
     <w:p>
@@ -137,7 +137,7 @@
         <w:pStyle w:val="Heading1"/>
       </w:pPr>
       <w:r>
-        <w:t>A responsibility to the world</w:t>
+        <w:t>Your style of family</w:t>
       </w:r>
     </w:p>
     <w:p>
@@ -145,46 +145,22 @@
         <w:pStyle w:val="Heading2"/>
       </w:pPr>
       <w:r>
-        <w:t>From the original founding letter</w:t>
+        <w:t>Welcome to University of Jasper</w:t>
       </w:r>
     </w:p>
     <w:p>
       <w:r>
-        <w:t>“We human beings have our special responsibilities to make our society and world better.”</w:t>
+        <w:t>We human beings have our special responsibilities to make our society and world better. So we not only focus on knowledge training, but also have a keen interest in the studies of our own minds and our history. We chase ancient civilization and culture.</w:t>
       </w:r>
     </w:p>
     <w:p>
       <w:r>
-        <w:rPr>
-          <w:color w:val="526879"/>
-          <w:sz w:val="18"/>
-        </w:rPr>
-        <w:t>The founder identifies the original letter as written in 2015. The welcome below is a contemporary adaptation of its ideas, with new language for this edition.</w:t>
+        <w:t>Welcome you to come here to grow up together and team work to realize our dreams. Hope U of Jasper is your style of family. We share each other's value and passion to make our school great.</w:t>
       </w:r>
     </w:p>
     <w:p>
       <w:r>
-        <w:t>Welcome to University of Jasper. My dream is to build a place where education reaches the whole person: our physical capacities, our understanding of the world and the responsibility we take for one another.</w:t>
-      </w:r>
-    </w:p>
-    <w:p>
-      <w:r>
-        <w:t>In my founding letter, I wrote that we have a responsibility to make our society and our world better. That conviction remains the starting point. Knowledge matters because of what we can understand, create and contribute through it.</w:t>
-      </w:r>
-    </w:p>
-    <w:p>
-      <w:r>
-        <w:t>I imagine people from different cultures coming to Jasper to learn together. We would train outdoors, investigate nature, read deeply, question inherited ideas and test our own. We would study the wisdom of ancient civilizations with the freedom to disagree and the courage to carry something valuable forward.</w:t>
-      </w:r>
-    </w:p>
-    <w:p>
-      <w:r>
-        <w:t>As technology becomes more powerful, I want us to become more capable: attentive, physically prepared, intellectually independent and responsible for what we create. Ambition should demand something of us. It should make us more honest in our work and more generous toward others.</w:t>
-      </w:r>
-    </w:p>
-    <w:p>
-      <w:r>
-        <w:t>One University → One Family expresses the community I hope we will build: a place of mutual care across borders and backgrounds, where belonging protects the freedom to think for yourself. Come with a difficult question, a willingness to practise and something you hope to give. Let us build this together.</w:t>
+        <w:t>Cheers!</w:t>
       </w:r>
     </w:p>
     <w:p>
@@ -194,6 +170,42 @@
           <w:sz w:val="18"/>
         </w:rPr>
         <w:t>Vincent Zhang · Founder</w:t>
+      </w:r>
+    </w:p>
+    <w:p>
+      <w:r>
+        <w:rPr>
+          <w:color w:val="526879"/>
+          <w:sz w:val="18"/>
+        </w:rPr>
+        <w:t>Original welcome, identified by Vincent Zhang as written in 2015; spacing normalized.</w:t>
+      </w:r>
+    </w:p>
+    <w:p>
+      <w:pPr>
+        <w:pStyle w:val="Heading2"/>
+      </w:pPr>
+      <w:r>
+        <w:t>The founding purpose today</w:t>
+      </w:r>
+    </w:p>
+    <w:p>
+      <w:r>
+        <w:t>As AI and robotics extend what people can do, education must deepen what people can understand, judge and take responsibility for.</w:t>
+      </w:r>
+    </w:p>
+    <w:p>
+      <w:r>
+        <w:t>Jasper brings physical practice, humanistic study and fundamental inquiry into an education whose quality becomes visible in what a learner can explain, do and contribute. The original welcome remains the starting point; the pages that follow develop the program.</w:t>
+      </w:r>
+    </w:p>
+    <w:p>
+      <w:r>
+        <w:rPr>
+          <w:color w:val="526879"/>
+          <w:sz w:val="18"/>
+        </w:rPr>
+        <w:t>The contemporary statement above is separate from the original letter.</w:t>
       </w:r>
     </w:p>
     <w:p>
@@ -211,7 +223,7 @@
     </w:p>
     <w:p>
       <w:r>
-        <w:t>To unite sustained physical training, humanistic learning across world civilizations, and original inquiry in mathematics, physics, chemistry and economics. Through life in nature, lectures, close dialogue, debate, field study, experiments and shared projects, we cultivate people of courage, deep learning, independent judgment, initiative, self-discipline and a commitment to justice. We use AI to extend inquiry while strengthening human understanding, creativity and responsibility.</w:t>
+        <w:t>To unite sustained physical training, humanistic learning across world civilisations, and original inquiry in mathematics, physics, chemistry and economics. Through life in nature, lectures, close dialogue, debate, field study, experiments and shared projects, we cultivate people of courage, deep learning, independent judgment, initiative, self-discipline and a commitment to justice. We use AI to extend inquiry while strengthening human understanding, creativity and responsibility. This is the long-term mission. The first field semester develops introductory foundations; it does not claim a university degree or a research qualification. AI study follows separately in the optional Return Lab.</w:t>
       </w:r>
     </w:p>
     <w:p>
@@ -237,7 +249,7 @@
     </w:p>
     <w:p>
       <w:r>
-        <w:t>Study philosophy, history, literature, art, ethics and social thought across civilizations. Read named texts in context, understand achievements and limitations, and engage real disagreements. Through comparison, debate and lived practice, develop freedom of thought, justice, integrity, restraint, empathy and the ability to lead responsibly.</w:t>
+        <w:t>Study philosophy, history, literature, art, ethics and social thought across civilisations. Read named texts in context, understand achievements and limitations, and engage real disagreements. Through comparison, debate and lived practice, develop freedom of thought, justice, integrity, restraint, empathy and the ability to lead responsibly.</w:t>
       </w:r>
     </w:p>
     <w:p>
@@ -282,7 +294,7 @@
     </w:p>
     <w:p>
       <w:r>
-        <w:t>We draw inspiration from ancient Greek inquiry and the education of body and mind; Bologna's traditions of protecting scholars; Vienna's research culture; classical study and close discussion at Oxford and Cambridge; the agency expressed in Harvard's elective tradition; and Humboldt's ideal of linking teaching and research. We bring these inspirations into conversation with the intellectual and cultural resources of civilizations around the world.</w:t>
+        <w:t>We draw inspiration from ancient Greek inquiry and the education of body and mind; Bologna's traditions of protecting scholars; Vienna's research culture; classical study and close discussion at Oxford and Cambridge; the agency expressed in Harvard's elective tradition; and Humboldt's ideal of linking teaching and research. We bring these inspirations into conversation with the intellectual and cultural resources of civilisations around the world.</w:t>
       </w:r>
     </w:p>
     <w:p>
@@ -329,7 +341,7 @@
     </w:p>
     <w:p>
       <w:r>
-        <w:t>Carry one worthwhile question across movement, close reading, scientific investigation and a contribution someone else can use. The same problem should become richer as you learn to see it through different disciplines.</w:t>
+        <w:t>Understanding demonstrated through responsible action. Carry a worthwhile question across movement, primary texts, scientific investigation and a contribution someone else can use. Each learner learns to defend a conclusion and act on it with judgment.</w:t>
       </w:r>
     </w:p>
     <w:p>
@@ -394,7 +406,7 @@
     </w:p>
     <w:p>
       <w:r>
-        <w:t>Warmth: What does it take to keep someone warm? Direction: How do you know which way to go? Conviction: What would change your mind? The instructor guide maps these inquiries into the existing course hours.</w:t>
+        <w:t>Warmth: What does it take to keep someone warm? Water: Where does the water go? Judgment: What would change your mind? The academic curriculum connects these questions through Jasper’s setting, weekly tutorials and useful original work.</w:t>
       </w:r>
     </w:p>
     <w:p>
@@ -421,7 +433,7 @@
     </w:p>
     <w:p>
       <w:r>
-        <w:t>Six weeks in person in Jasper for a target cohort of 6–8 adults aged 18 or older. Four teaching days each week provide 144 facilitated learning hours. Three proposed camping nights fall in Weeks 2 and 5.</w:t>
+        <w:t>Six weeks in person in Jasper for 6–8 adults aged 18 or older. Four teaching days each week provide 144 facilitated hours. Plan four additional hours of independent study weekly: 24 across the semester. Three proposed camping nights fall in Weeks 2 and 5.</w:t>
       </w:r>
     </w:p>
     <w:tbl>
@@ -429,6 +441,14 @@
         <w:tblW w:type="auto" w:w="0"/>
         <w:tblLayout w:type="fixed"/>
         <w:tblLook w:firstColumn="1" w:firstRow="1" w:lastColumn="0" w:lastRow="0" w:noHBand="0" w:noVBand="1" w:val="04A0"/>
+        <w:tblBorders>
+          <w:top w:val="single" w:sz="4" w:color="D9D9D9"/>
+          <w:left w:val="single" w:sz="4" w:color="D9D9D9"/>
+          <w:bottom w:val="single" w:sz="4" w:color="D9D9D9"/>
+          <w:right w:val="single" w:sz="4" w:color="D9D9D9"/>
+          <w:insideH w:val="single" w:sz="4" w:color="D9D9D9"/>
+          <w:insideV w:val="single" w:sz="4" w:color="D9D9D9"/>
+        </w:tblBorders>
       </w:tblPr>
       <w:tblGrid>
         <w:gridCol w:w="8080"/>
@@ -436,22 +456,24 @@
       </w:tblGrid>
       <w:tr>
         <w:trPr>
+          <w:cantSplit/>
           <w:tblHeader/>
         </w:trPr>
         <w:tc>
           <w:tcPr>
             <w:tcW w:type="dxa" w:w="8080"/>
+            <w:vAlign w:val="center"/>
             <w:shd w:fill="175D93"/>
           </w:tcPr>
           <w:p>
             <w:pPr>
-              <w:spacing w:before="100" w:after="100"/>
+              <w:spacing w:before="80" w:after="80"/>
             </w:pPr>
             <w:r>
               <w:rPr>
                 <w:b/>
                 <w:color w:val="FFFFFF"/>
-                <w:sz w:val="19"/>
+                <w:sz w:val="18"/>
               </w:rPr>
               <w:t>Course</w:t>
             </w:r>
@@ -460,17 +482,18 @@
         <w:tc>
           <w:tcPr>
             <w:tcW w:type="dxa" w:w="1712"/>
+            <w:vAlign w:val="center"/>
             <w:shd w:fill="175D93"/>
           </w:tcPr>
           <w:p>
             <w:pPr>
-              <w:spacing w:before="100" w:after="100"/>
+              <w:spacing w:before="80" w:after="80"/>
             </w:pPr>
             <w:r>
               <w:rPr>
                 <w:b/>
                 <w:color w:val="FFFFFF"/>
-                <w:sz w:val="19"/>
+                <w:sz w:val="18"/>
               </w:rPr>
               <w:t>Hours</w:t>
             </w:r>
@@ -478,39 +501,44 @@
         </w:tc>
       </w:tr>
       <w:tr>
+        <w:trPr>
+          <w:cantSplit/>
+        </w:trPr>
         <w:tc>
           <w:tcPr>
             <w:tcW w:type="dxa" w:w="8080"/>
+            <w:vAlign w:val="center"/>
             <w:shd w:fill="EDF4F8"/>
           </w:tcPr>
           <w:p>
             <w:pPr>
-              <w:spacing w:before="100" w:after="100"/>
+              <w:spacing w:before="80" w:after="80"/>
             </w:pPr>
             <w:r>
               <w:rPr>
                 <w:b w:val="0"/>
                 <w:color w:val="000000"/>
-                <w:sz w:val="19"/>
+                <w:sz w:val="18"/>
               </w:rPr>
-              <w:t>Fieldcraft, hiking and camping</w:t>
+              <w:t>Fieldcraft and physical practice</w:t>
             </w:r>
           </w:p>
         </w:tc>
         <w:tc>
           <w:tcPr>
             <w:tcW w:type="dxa" w:w="1712"/>
+            <w:vAlign w:val="center"/>
             <w:shd w:fill="EDF4F8"/>
           </w:tcPr>
           <w:p>
             <w:pPr>
-              <w:spacing w:before="100" w:after="100"/>
+              <w:spacing w:before="80" w:after="80"/>
             </w:pPr>
             <w:r>
               <w:rPr>
                 <w:b w:val="0"/>
                 <w:color w:val="000000"/>
-                <w:sz w:val="19"/>
+                <w:sz w:val="18"/>
               </w:rPr>
               <w:t>36</w:t>
             </w:r>
@@ -518,20 +546,24 @@
         </w:tc>
       </w:tr>
       <w:tr>
+        <w:trPr>
+          <w:cantSplit/>
+        </w:trPr>
         <w:tc>
           <w:tcPr>
             <w:tcW w:type="dxa" w:w="8080"/>
-            <w:shd w:fill="F7FAFC"/>
+            <w:vAlign w:val="center"/>
+            <w:shd w:fill="FFFFFF"/>
           </w:tcPr>
           <w:p>
             <w:pPr>
-              <w:spacing w:before="100" w:after="100"/>
+              <w:spacing w:before="80" w:after="80"/>
             </w:pPr>
             <w:r>
               <w:rPr>
                 <w:b w:val="0"/>
                 <w:color w:val="000000"/>
-                <w:sz w:val="19"/>
+                <w:sz w:val="18"/>
               </w:rPr>
               <w:t>Martial arts and restraint</w:t>
             </w:r>
@@ -540,17 +572,18 @@
         <w:tc>
           <w:tcPr>
             <w:tcW w:type="dxa" w:w="1712"/>
-            <w:shd w:fill="F7FAFC"/>
+            <w:vAlign w:val="center"/>
+            <w:shd w:fill="FFFFFF"/>
           </w:tcPr>
           <w:p>
             <w:pPr>
-              <w:spacing w:before="100" w:after="100"/>
+              <w:spacing w:before="80" w:after="80"/>
             </w:pPr>
             <w:r>
               <w:rPr>
                 <w:b w:val="0"/>
                 <w:color w:val="000000"/>
-                <w:sz w:val="19"/>
+                <w:sz w:val="18"/>
               </w:rPr>
               <w:t>18</w:t>
             </w:r>
@@ -558,20 +591,24 @@
         </w:tc>
       </w:tr>
       <w:tr>
+        <w:trPr>
+          <w:cantSplit/>
+        </w:trPr>
         <w:tc>
           <w:tcPr>
             <w:tcW w:type="dxa" w:w="8080"/>
+            <w:vAlign w:val="center"/>
             <w:shd w:fill="EDF4F8"/>
           </w:tcPr>
           <w:p>
             <w:pPr>
-              <w:spacing w:before="100" w:after="100"/>
+              <w:spacing w:before="80" w:after="80"/>
             </w:pPr>
             <w:r>
               <w:rPr>
                 <w:b w:val="0"/>
                 <w:color w:val="000000"/>
-                <w:sz w:val="19"/>
+                <w:sz w:val="18"/>
               </w:rPr>
               <w:t>Attention and reflective practice</w:t>
             </w:r>
@@ -580,17 +617,18 @@
         <w:tc>
           <w:tcPr>
             <w:tcW w:type="dxa" w:w="1712"/>
+            <w:vAlign w:val="center"/>
             <w:shd w:fill="EDF4F8"/>
           </w:tcPr>
           <w:p>
             <w:pPr>
-              <w:spacing w:before="100" w:after="100"/>
+              <w:spacing w:before="80" w:after="80"/>
             </w:pPr>
             <w:r>
               <w:rPr>
                 <w:b w:val="0"/>
                 <w:color w:val="000000"/>
-                <w:sz w:val="19"/>
+                <w:sz w:val="18"/>
               </w:rPr>
               <w:t>12</w:t>
             </w:r>
@@ -598,39 +636,44 @@
         </w:tc>
       </w:tr>
       <w:tr>
+        <w:trPr>
+          <w:cantSplit/>
+        </w:trPr>
         <w:tc>
           <w:tcPr>
             <w:tcW w:type="dxa" w:w="8080"/>
-            <w:shd w:fill="F7FAFC"/>
+            <w:vAlign w:val="center"/>
+            <w:shd w:fill="FFFFFF"/>
           </w:tcPr>
           <w:p>
             <w:pPr>
-              <w:spacing w:before="100" w:after="100"/>
+              <w:spacing w:before="80" w:after="80"/>
             </w:pPr>
             <w:r>
               <w:rPr>
                 <w:b w:val="0"/>
                 <w:color w:val="000000"/>
-                <w:sz w:val="19"/>
+                <w:sz w:val="18"/>
               </w:rPr>
-              <w:t>Mathematics and physics in nature</w:t>
+              <w:t>Jasper as Laboratory</w:t>
             </w:r>
           </w:p>
         </w:tc>
         <w:tc>
           <w:tcPr>
             <w:tcW w:type="dxa" w:w="1712"/>
-            <w:shd w:fill="F7FAFC"/>
+            <w:vAlign w:val="center"/>
+            <w:shd w:fill="FFFFFF"/>
           </w:tcPr>
           <w:p>
             <w:pPr>
-              <w:spacing w:before="100" w:after="100"/>
+              <w:spacing w:before="80" w:after="80"/>
             </w:pPr>
             <w:r>
               <w:rPr>
                 <w:b w:val="0"/>
                 <w:color w:val="000000"/>
-                <w:sz w:val="19"/>
+                <w:sz w:val="18"/>
               </w:rPr>
               <w:t>30</w:t>
             </w:r>
@@ -638,39 +681,44 @@
         </w:tc>
       </w:tr>
       <w:tr>
+        <w:trPr>
+          <w:cantSplit/>
+        </w:trPr>
         <w:tc>
           <w:tcPr>
             <w:tcW w:type="dxa" w:w="8080"/>
+            <w:vAlign w:val="center"/>
             <w:shd w:fill="EDF4F8"/>
           </w:tcPr>
           <w:p>
             <w:pPr>
-              <w:spacing w:before="100" w:after="100"/>
+              <w:spacing w:before="80" w:after="80"/>
             </w:pPr>
             <w:r>
               <w:rPr>
                 <w:b w:val="0"/>
                 <w:color w:val="000000"/>
-                <w:sz w:val="19"/>
+                <w:sz w:val="18"/>
               </w:rPr>
-              <w:t>Philosophy, reading and argument</w:t>
+              <w:t>Philosophy and the Jasper Tutorial</w:t>
             </w:r>
           </w:p>
         </w:tc>
         <w:tc>
           <w:tcPr>
             <w:tcW w:type="dxa" w:w="1712"/>
+            <w:vAlign w:val="center"/>
             <w:shd w:fill="EDF4F8"/>
           </w:tcPr>
           <w:p>
             <w:pPr>
-              <w:spacing w:before="100" w:after="100"/>
+              <w:spacing w:before="80" w:after="80"/>
             </w:pPr>
             <w:r>
               <w:rPr>
                 <w:b w:val="0"/>
                 <w:color w:val="000000"/>
-                <w:sz w:val="19"/>
+                <w:sz w:val="18"/>
               </w:rPr>
               <w:t>30</w:t>
             </w:r>
@@ -678,39 +726,44 @@
         </w:tc>
       </w:tr>
       <w:tr>
+        <w:trPr>
+          <w:cantSplit/>
+        </w:trPr>
         <w:tc>
           <w:tcPr>
             <w:tcW w:type="dxa" w:w="8080"/>
-            <w:shd w:fill="F7FAFC"/>
+            <w:vAlign w:val="center"/>
+            <w:shd w:fill="FFFFFF"/>
           </w:tcPr>
           <w:p>
             <w:pPr>
-              <w:spacing w:before="100" w:after="100"/>
+              <w:spacing w:before="80" w:after="80"/>
             </w:pPr>
             <w:r>
               <w:rPr>
                 <w:b w:val="0"/>
                 <w:color w:val="000000"/>
-                <w:sz w:val="19"/>
+                <w:sz w:val="18"/>
               </w:rPr>
-              <w:t>The commons and original inquiry</w:t>
+              <w:t>The Commons and original inquiry</w:t>
             </w:r>
           </w:p>
         </w:tc>
         <w:tc>
           <w:tcPr>
             <w:tcW w:type="dxa" w:w="1712"/>
-            <w:shd w:fill="F7FAFC"/>
+            <w:vAlign w:val="center"/>
+            <w:shd w:fill="FFFFFF"/>
           </w:tcPr>
           <w:p>
             <w:pPr>
-              <w:spacing w:before="100" w:after="100"/>
+              <w:spacing w:before="80" w:after="80"/>
             </w:pPr>
             <w:r>
               <w:rPr>
                 <w:b w:val="0"/>
                 <w:color w:val="000000"/>
-                <w:sz w:val="19"/>
+                <w:sz w:val="18"/>
               </w:rPr>
               <w:t>18</w:t>
             </w:r>
@@ -718,20 +771,24 @@
         </w:tc>
       </w:tr>
       <w:tr>
+        <w:trPr>
+          <w:cantSplit/>
+        </w:trPr>
         <w:tc>
           <w:tcPr>
             <w:tcW w:type="dxa" w:w="8080"/>
+            <w:vAlign w:val="center"/>
             <w:shd w:fill="EDF4F8"/>
           </w:tcPr>
           <w:p>
             <w:pPr>
-              <w:spacing w:before="100" w:after="100"/>
+              <w:spacing w:before="80" w:after="80"/>
             </w:pPr>
             <w:r>
               <w:rPr>
                 <w:b w:val="0"/>
                 <w:color w:val="000000"/>
-                <w:sz w:val="19"/>
+                <w:sz w:val="18"/>
               </w:rPr>
               <w:t>Total facilitated learning</w:t>
             </w:r>
@@ -740,17 +797,18 @@
         <w:tc>
           <w:tcPr>
             <w:tcW w:type="dxa" w:w="1712"/>
+            <w:vAlign w:val="center"/>
             <w:shd w:fill="EDF4F8"/>
           </w:tcPr>
           <w:p>
             <w:pPr>
-              <w:spacing w:before="100" w:after="100"/>
+              <w:spacing w:before="80" w:after="80"/>
             </w:pPr>
             <w:r>
               <w:rPr>
                 <w:b w:val="0"/>
                 <w:color w:val="000000"/>
-                <w:sz w:val="19"/>
+                <w:sz w:val="18"/>
               </w:rPr>
               <w:t>144</w:t>
             </w:r>
@@ -768,12 +826,12 @@
         <w:pStyle w:val="Heading2"/>
       </w:pPr>
       <w:r>
-        <w:t>A curriculum that connects</w:t>
+        <w:t>A stronger practice</w:t>
       </w:r>
     </w:p>
     <w:p>
       <w:r>
-        <w:t>Chemistry enters through materials, heat and scientific explanation. Economics enters through resources, trade-offs and the commons. Introductory martial practice is coached for control; attention practice is voluntary and adaptable.</w:t>
+        <w:t>The 36-hour field course includes 12 coached 30-minute strength sessions. Weekly two-person tutorials sit inside philosophy, with a second tutor explicitly resourced. Science connects mathematics, physics and chemistry to Jasper; the Commons develops economic reasoning and practical contribution.</w:t>
       </w:r>
     </w:p>
     <w:p>
@@ -786,7 +844,7 @@
     </w:p>
     <w:p>
       <w:r>
-        <w:t>Winter break runs from mid-December to mid-February, approximately two months. Required teaching and camps take place outside this period. Exact cohort dates remain unconfirmed.</w:t>
+        <w:t>Winter break runs from mid-December to mid-February, approximately two months. Exact cohort dates remain unconfirmed. The optional AI Return Lab is outside the six-week core.</w:t>
       </w:r>
     </w:p>
     <w:p>
@@ -795,7 +853,7 @@
           <w:color w:val="526879"/>
           <w:sz w:val="18"/>
         </w:rPr>
-        <w:t>Camp nights do not add overnight clock hours to the 144 facilitated hours. Rest, meals, travel and staff camp duty require separate planning. Fees, subsidies and included costs remain unconfirmed.</w:t>
+        <w:t>Meals, travel, camp duty and rest are separately planned. Six-week accommodation, fees and included costs are not confirmed.</w:t>
       </w:r>
     </w:p>
     <w:p>
@@ -816,6 +874,14 @@
         <w:tblW w:type="auto" w:w="0"/>
         <w:tblLayout w:type="fixed"/>
         <w:tblLook w:firstColumn="1" w:firstRow="1" w:lastColumn="0" w:lastRow="0" w:noHBand="0" w:noVBand="1" w:val="04A0"/>
+        <w:tblBorders>
+          <w:top w:val="single" w:sz="4" w:color="D9D9D9"/>
+          <w:left w:val="single" w:sz="4" w:color="D9D9D9"/>
+          <w:bottom w:val="single" w:sz="4" w:color="D9D9D9"/>
+          <w:right w:val="single" w:sz="4" w:color="D9D9D9"/>
+          <w:insideH w:val="single" w:sz="4" w:color="D9D9D9"/>
+          <w:insideV w:val="single" w:sz="4" w:color="D9D9D9"/>
+        </w:tblBorders>
       </w:tblPr>
       <w:tblGrid>
         <w:gridCol w:w="1962"/>
@@ -824,22 +890,24 @@
       </w:tblGrid>
       <w:tr>
         <w:trPr>
+          <w:cantSplit/>
           <w:tblHeader/>
         </w:trPr>
         <w:tc>
           <w:tcPr>
             <w:tcW w:type="dxa" w:w="1962"/>
+            <w:vAlign w:val="center"/>
             <w:shd w:fill="175D93"/>
           </w:tcPr>
           <w:p>
             <w:pPr>
-              <w:spacing w:before="100" w:after="100"/>
+              <w:spacing w:before="80" w:after="80"/>
             </w:pPr>
             <w:r>
               <w:rPr>
                 <w:b/>
                 <w:color w:val="FFFFFF"/>
-                <w:sz w:val="19"/>
+                <w:sz w:val="18"/>
               </w:rPr>
               <w:t>Week</w:t>
             </w:r>
@@ -848,17 +916,18 @@
         <w:tc>
           <w:tcPr>
             <w:tcW w:type="dxa" w:w="3213"/>
+            <w:vAlign w:val="center"/>
             <w:shd w:fill="175D93"/>
           </w:tcPr>
           <w:p>
             <w:pPr>
-              <w:spacing w:before="100" w:after="100"/>
+              <w:spacing w:before="80" w:after="80"/>
             </w:pPr>
             <w:r>
               <w:rPr>
                 <w:b/>
                 <w:color w:val="FFFFFF"/>
-                <w:sz w:val="19"/>
+                <w:sz w:val="18"/>
               </w:rPr>
               <w:t>Question</w:t>
             </w:r>
@@ -867,17 +936,18 @@
         <w:tc>
           <w:tcPr>
             <w:tcW w:type="dxa" w:w="4617"/>
+            <w:vAlign w:val="center"/>
             <w:shd w:fill="175D93"/>
           </w:tcPr>
           <w:p>
             <w:pPr>
-              <w:spacing w:before="100" w:after="100"/>
+              <w:spacing w:before="80" w:after="80"/>
             </w:pPr>
             <w:r>
               <w:rPr>
                 <w:b/>
                 <w:color w:val="FFFFFF"/>
-                <w:sz w:val="19"/>
+                <w:sz w:val="18"/>
               </w:rPr>
               <w:t>Evidence</w:t>
             </w:r>
@@ -885,20 +955,24 @@
         </w:tc>
       </w:tr>
       <w:tr>
+        <w:trPr>
+          <w:cantSplit/>
+        </w:trPr>
         <w:tc>
           <w:tcPr>
             <w:tcW w:type="dxa" w:w="1962"/>
+            <w:vAlign w:val="center"/>
             <w:shd w:fill="EDF4F8"/>
           </w:tcPr>
           <w:p>
             <w:pPr>
-              <w:spacing w:before="100" w:after="100"/>
+              <w:spacing w:before="80" w:after="80"/>
             </w:pPr>
             <w:r>
               <w:rPr>
                 <w:b w:val="0"/>
                 <w:color w:val="000000"/>
-                <w:sz w:val="19"/>
+                <w:sz w:val="18"/>
               </w:rPr>
               <w:t>1 / Attention</w:t>
             </w:r>
@@ -907,17 +981,18 @@
         <w:tc>
           <w:tcPr>
             <w:tcW w:type="dxa" w:w="3213"/>
+            <w:vAlign w:val="center"/>
             <w:shd w:fill="EDF4F8"/>
           </w:tcPr>
           <w:p>
             <w:pPr>
-              <w:spacing w:before="100" w:after="100"/>
+              <w:spacing w:before="80" w:after="80"/>
             </w:pPr>
             <w:r>
               <w:rPr>
                 <w:b w:val="0"/>
                 <w:color w:val="000000"/>
-                <w:sz w:val="19"/>
+                <w:sz w:val="18"/>
               </w:rPr>
               <w:t>What do I notice?</w:t>
             </w:r>
@@ -926,17 +1001,18 @@
         <w:tc>
           <w:tcPr>
             <w:tcW w:type="dxa" w:w="4617"/>
+            <w:vAlign w:val="center"/>
             <w:shd w:fill="EDF4F8"/>
           </w:tcPr>
           <w:p>
             <w:pPr>
-              <w:spacing w:before="100" w:after="100"/>
+              <w:spacing w:before="80" w:after="80"/>
             </w:pPr>
             <w:r>
               <w:rPr>
                 <w:b w:val="0"/>
                 <w:color w:val="000000"/>
-                <w:sz w:val="19"/>
+                <w:sz w:val="18"/>
               </w:rPr>
               <w:t>Observation baseline and a first position.</w:t>
             </w:r>
@@ -944,20 +1020,24 @@
         </w:tc>
       </w:tr>
       <w:tr>
+        <w:trPr>
+          <w:cantSplit/>
+        </w:trPr>
         <w:tc>
           <w:tcPr>
             <w:tcW w:type="dxa" w:w="1962"/>
-            <w:shd w:fill="F7FAFC"/>
+            <w:vAlign w:val="center"/>
+            <w:shd w:fill="FFFFFF"/>
           </w:tcPr>
           <w:p>
             <w:pPr>
-              <w:spacing w:before="100" w:after="100"/>
+              <w:spacing w:before="80" w:after="80"/>
             </w:pPr>
             <w:r>
               <w:rPr>
                 <w:b w:val="0"/>
                 <w:color w:val="000000"/>
-                <w:sz w:val="19"/>
+                <w:sz w:val="18"/>
               </w:rPr>
               <w:t>2 / Discipline</w:t>
             </w:r>
@@ -966,17 +1046,18 @@
         <w:tc>
           <w:tcPr>
             <w:tcW w:type="dxa" w:w="3213"/>
-            <w:shd w:fill="F7FAFC"/>
+            <w:vAlign w:val="center"/>
+            <w:shd w:fill="FFFFFF"/>
           </w:tcPr>
           <w:p>
             <w:pPr>
-              <w:spacing w:before="100" w:after="100"/>
+              <w:spacing w:before="80" w:after="80"/>
             </w:pPr>
             <w:r>
               <w:rPr>
                 <w:b w:val="0"/>
                 <w:color w:val="000000"/>
-                <w:sz w:val="19"/>
+                <w:sz w:val="18"/>
               </w:rPr>
               <w:t>When does restraint make us stronger?</w:t>
             </w:r>
@@ -985,17 +1066,18 @@
         <w:tc>
           <w:tcPr>
             <w:tcW w:type="dxa" w:w="4617"/>
-            <w:shd w:fill="F7FAFC"/>
+            <w:vAlign w:val="center"/>
+            <w:shd w:fill="FFFFFF"/>
           </w:tcPr>
           <w:p>
             <w:pPr>
-              <w:spacing w:before="100" w:after="100"/>
+              <w:spacing w:before="80" w:after="80"/>
             </w:pPr>
             <w:r>
               <w:rPr>
                 <w:b w:val="0"/>
                 <w:color w:val="000000"/>
-                <w:sz w:val="19"/>
+                <w:sz w:val="18"/>
               </w:rPr>
               <w:t>First camp review and a reasoned practice plan.</w:t>
             </w:r>
@@ -1003,20 +1085,24 @@
         </w:tc>
       </w:tr>
       <w:tr>
+        <w:trPr>
+          <w:cantSplit/>
+        </w:trPr>
         <w:tc>
           <w:tcPr>
             <w:tcW w:type="dxa" w:w="1962"/>
+            <w:vAlign w:val="center"/>
             <w:shd w:fill="EDF4F8"/>
           </w:tcPr>
           <w:p>
             <w:pPr>
-              <w:spacing w:before="100" w:after="100"/>
+              <w:spacing w:before="80" w:after="80"/>
             </w:pPr>
             <w:r>
               <w:rPr>
                 <w:b w:val="0"/>
                 <w:color w:val="000000"/>
-                <w:sz w:val="19"/>
+                <w:sz w:val="18"/>
               </w:rPr>
               <w:t>3 / Evidence</w:t>
             </w:r>
@@ -1025,17 +1111,18 @@
         <w:tc>
           <w:tcPr>
             <w:tcW w:type="dxa" w:w="3213"/>
+            <w:vAlign w:val="center"/>
             <w:shd w:fill="EDF4F8"/>
           </w:tcPr>
           <w:p>
             <w:pPr>
-              <w:spacing w:before="100" w:after="100"/>
+              <w:spacing w:before="80" w:after="80"/>
             </w:pPr>
             <w:r>
               <w:rPr>
                 <w:b w:val="0"/>
                 <w:color w:val="000000"/>
-                <w:sz w:val="19"/>
+                <w:sz w:val="18"/>
               </w:rPr>
               <w:t>What would change my mind?</w:t>
             </w:r>
@@ -1044,17 +1131,18 @@
         <w:tc>
           <w:tcPr>
             <w:tcW w:type="dxa" w:w="4617"/>
+            <w:vAlign w:val="center"/>
             <w:shd w:fill="EDF4F8"/>
           </w:tcPr>
           <w:p>
             <w:pPr>
-              <w:spacing w:before="100" w:after="100"/>
+              <w:spacing w:before="80" w:after="80"/>
             </w:pPr>
             <w:r>
               <w:rPr>
                 <w:b w:val="0"/>
                 <w:color w:val="000000"/>
-                <w:sz w:val="19"/>
+                <w:sz w:val="18"/>
               </w:rPr>
               <w:t>Repeatable experiment and revised claim.</w:t>
             </w:r>
@@ -1062,20 +1150,24 @@
         </w:tc>
       </w:tr>
       <w:tr>
+        <w:trPr>
+          <w:cantSplit/>
+        </w:trPr>
         <w:tc>
           <w:tcPr>
             <w:tcW w:type="dxa" w:w="1962"/>
-            <w:shd w:fill="F7FAFC"/>
+            <w:vAlign w:val="center"/>
+            <w:shd w:fill="FFFFFF"/>
           </w:tcPr>
           <w:p>
             <w:pPr>
-              <w:spacing w:before="100" w:after="100"/>
+              <w:spacing w:before="80" w:after="80"/>
             </w:pPr>
             <w:r>
               <w:rPr>
                 <w:b w:val="0"/>
                 <w:color w:val="000000"/>
-                <w:sz w:val="19"/>
+                <w:sz w:val="18"/>
               </w:rPr>
               <w:t>4 / Freedom</w:t>
             </w:r>
@@ -1084,17 +1176,18 @@
         <w:tc>
           <w:tcPr>
             <w:tcW w:type="dxa" w:w="3213"/>
-            <w:shd w:fill="F7FAFC"/>
+            <w:vAlign w:val="center"/>
+            <w:shd w:fill="FFFFFF"/>
           </w:tcPr>
           <w:p>
             <w:pPr>
-              <w:spacing w:before="100" w:after="100"/>
+              <w:spacing w:before="80" w:after="80"/>
             </w:pPr>
             <w:r>
               <w:rPr>
                 <w:b w:val="0"/>
                 <w:color w:val="000000"/>
-                <w:sz w:val="19"/>
+                <w:sz w:val="18"/>
               </w:rPr>
               <w:t>What makes disagreement productive?</w:t>
             </w:r>
@@ -1103,17 +1196,18 @@
         <w:tc>
           <w:tcPr>
             <w:tcW w:type="dxa" w:w="4617"/>
-            <w:shd w:fill="F7FAFC"/>
+            <w:vAlign w:val="center"/>
+            <w:shd w:fill="FFFFFF"/>
           </w:tcPr>
           <w:p>
             <w:pPr>
-              <w:spacing w:before="100" w:after="100"/>
+              <w:spacing w:before="80" w:after="80"/>
             </w:pPr>
             <w:r>
               <w:rPr>
                 <w:b w:val="0"/>
                 <w:color w:val="000000"/>
-                <w:sz w:val="19"/>
+                <w:sz w:val="18"/>
               </w:rPr>
               <w:t>Fair debate and a capstone proposal.</w:t>
             </w:r>
@@ -1121,20 +1215,24 @@
         </w:tc>
       </w:tr>
       <w:tr>
+        <w:trPr>
+          <w:cantSplit/>
+        </w:trPr>
         <w:tc>
           <w:tcPr>
             <w:tcW w:type="dxa" w:w="1962"/>
+            <w:vAlign w:val="center"/>
             <w:shd w:fill="EDF4F8"/>
           </w:tcPr>
           <w:p>
             <w:pPr>
-              <w:spacing w:before="100" w:after="100"/>
+              <w:spacing w:before="80" w:after="80"/>
             </w:pPr>
             <w:r>
               <w:rPr>
                 <w:b w:val="0"/>
                 <w:color w:val="000000"/>
-                <w:sz w:val="19"/>
+                <w:sz w:val="18"/>
               </w:rPr>
               <w:t>5 / Responsibility</w:t>
             </w:r>
@@ -1143,17 +1241,18 @@
         <w:tc>
           <w:tcPr>
             <w:tcW w:type="dxa" w:w="3213"/>
+            <w:vAlign w:val="center"/>
             <w:shd w:fill="EDF4F8"/>
           </w:tcPr>
           <w:p>
             <w:pPr>
-              <w:spacing w:before="100" w:after="100"/>
+              <w:spacing w:before="80" w:after="80"/>
             </w:pPr>
             <w:r>
               <w:rPr>
                 <w:b w:val="0"/>
                 <w:color w:val="000000"/>
-                <w:sz w:val="19"/>
+                <w:sz w:val="18"/>
               </w:rPr>
               <w:t>What do I owe to others?</w:t>
             </w:r>
@@ -1162,17 +1261,18 @@
         <w:tc>
           <w:tcPr>
             <w:tcW w:type="dxa" w:w="4617"/>
+            <w:vAlign w:val="center"/>
             <w:shd w:fill="EDF4F8"/>
           </w:tcPr>
           <w:p>
             <w:pPr>
-              <w:spacing w:before="100" w:after="100"/>
+              <w:spacing w:before="80" w:after="80"/>
             </w:pPr>
             <w:r>
               <w:rPr>
                 <w:b w:val="0"/>
                 <w:color w:val="000000"/>
-                <w:sz w:val="19"/>
+                <w:sz w:val="18"/>
               </w:rPr>
               <w:t>Two-night camp review and a prototype test.</w:t>
             </w:r>
@@ -1180,20 +1280,24 @@
         </w:tc>
       </w:tr>
       <w:tr>
+        <w:trPr>
+          <w:cantSplit/>
+        </w:trPr>
         <w:tc>
           <w:tcPr>
             <w:tcW w:type="dxa" w:w="1962"/>
-            <w:shd w:fill="F7FAFC"/>
+            <w:vAlign w:val="center"/>
+            <w:shd w:fill="FFFFFF"/>
           </w:tcPr>
           <w:p>
             <w:pPr>
-              <w:spacing w:before="100" w:after="100"/>
+              <w:spacing w:before="80" w:after="80"/>
             </w:pPr>
             <w:r>
               <w:rPr>
                 <w:b w:val="0"/>
                 <w:color w:val="000000"/>
-                <w:sz w:val="19"/>
+                <w:sz w:val="18"/>
               </w:rPr>
               <w:t>6 / Contribution</w:t>
             </w:r>
@@ -1202,17 +1306,18 @@
         <w:tc>
           <w:tcPr>
             <w:tcW w:type="dxa" w:w="3213"/>
-            <w:shd w:fill="F7FAFC"/>
+            <w:vAlign w:val="center"/>
+            <w:shd w:fill="FFFFFF"/>
           </w:tcPr>
           <w:p>
             <w:pPr>
-              <w:spacing w:before="100" w:after="100"/>
+              <w:spacing w:before="80" w:after="80"/>
             </w:pPr>
             <w:r>
               <w:rPr>
                 <w:b w:val="0"/>
                 <w:color w:val="000000"/>
-                <w:sz w:val="19"/>
+                <w:sz w:val="18"/>
               </w:rPr>
               <w:t>What can I now explain, do and give?</w:t>
             </w:r>
@@ -1221,17 +1326,18 @@
         <w:tc>
           <w:tcPr>
             <w:tcW w:type="dxa" w:w="4617"/>
-            <w:shd w:fill="F7FAFC"/>
+            <w:vAlign w:val="center"/>
+            <w:shd w:fill="FFFFFF"/>
           </w:tcPr>
           <w:p>
             <w:pPr>
-              <w:spacing w:before="100" w:after="100"/>
+              <w:spacing w:before="80" w:after="80"/>
             </w:pPr>
             <w:r>
               <w:rPr>
                 <w:b w:val="0"/>
                 <w:color w:val="000000"/>
-                <w:sz w:val="19"/>
+                <w:sz w:val="18"/>
               </w:rPr>
               <w:t>Final portfolio and individual oral defence.</w:t>
             </w:r>
@@ -1267,7 +1373,7 @@
     </w:p>
     <w:p>
       <w:r>
-        <w:t>Six weekly entries, a capstone and instructor-reviewed field and martial demonstrations, meeting the guide’s introductory standard after revision. Completion would receive a descriptive non-credit record. No degree, academic credit or professional certification is offered.</w:t>
+        <w:t>Six weekly entries; two revised essays of 1,200–1,500 words each or an agreed equivalent; a scientific dossier; an individual defence; useful original work; and coached field and physical demonstrations. Completion would receive a descriptive non-credit record. No degree or professional certification is offered.</w:t>
       </w:r>
     </w:p>
     <w:p>
@@ -1341,7 +1447,7 @@
         <w:pStyle w:val="Heading2"/>
       </w:pPr>
       <w:r>
-        <w:t>Learning across civilizations</w:t>
+        <w:t>Learning across civilisations</w:t>
       </w:r>
     </w:p>
     <w:p>
@@ -1372,7 +1478,7 @@
     </w:p>
     <w:p>
       <w:r>
-        <w:t>The field semester is taught offline: paper, direct observation, close conversation and original work. Personal phones, internet and live AI are set aside during teaching and camps. Staff emergency communications remain available, with private medical, accessibility and essential-contact exceptions. Printed claims allow learners to examine AI-style reasoning without using a device. An optional connected audit before or after the semester sits outside the 144-hour core.</w:t>
+        <w:t>The six-week core is offline: direct observation, paper, conversation and original work. Personal phones, internet and live AI are set aside during teaching and camps; staff emergency communications and private access exceptions remain. After the semester, an optional three-hour AI Return Lab compares a learner’s preserved work with recorded model outputs. It is separately scheduled and resourced, outside the 144 facilitated hours and 24 independent-study hours. No seventh residential week is promised.</w:t>
       </w:r>
     </w:p>
     <w:p>
@@ -1420,7 +1526,7 @@
     </w:p>
     <w:p>
       <w:r>
-        <w:t>The six course areas require scientific, humanistic, outdoor, martial, reflective and facilitation competence. One person may hold several roles when qualified and available. Outdoor delivery requires suitable local leadership and staff coverage; enthusiasm alone is insufficient.</w:t>
+        <w:t>The six course areas require scientific, humanistic, outdoor, strength-coaching, martial and facilitation competence. Weekly tutorial rotations require a second academically competent tutor for one hour. Field delivery needs a guide and assistant, with camp duty separately covered.</w:t>
       </w:r>
     </w:p>
     <w:p>
@@ -1446,7 +1552,7 @@
     </w:p>
     <w:p>
       <w:r>
-        <w:t>The website provides teacher and student application drafts, review and local download. There is no active submission inbox, selection decision or job offer. Enrolment, compensation, costs and delivery dates will be published only when established.</w:t>
+        <w:t>General inquiries are welcome at vincent@ujasper.ca. Formal admissions and appointments are not open. Website forms prepare local drafts and never submit automatically; a draft is not an application, reservation or offer. Enrolment conditions, compensation, costs and delivery dates will be published when established.</w:t>
       </w:r>
     </w:p>
     <w:p>
@@ -1468,7 +1574,7 @@
           <w:color w:val="526879"/>
           <w:sz w:val="18"/>
         </w:rPr>
-        <w:t>The founder will establish the official @ujasper.ca mailbox. No address is assumed or invented in this edition.</w:t>
+        <w:t>Share relevant interests or work in a general inquiry. Do not send sensitive health records, identification documents or money. A future admissions notice will state criteria, deadlines and the review process.</w:t>
       </w:r>
     </w:p>
     <w:p>
@@ -1499,7 +1605,7 @@
     </w:p>
     <w:p>
       <w:r>
-        <w:t>The Founding Five remains the founder’s proposal: five founding positions at C$2 million each, seeking C$10 million in total. Vincent Zhang’s intended model includes lifetime board voting rights. Those rights are not established and cannot be promised in exchange for a contribution. The legal structure, election and removal rules, director duties, total board composition and the founder’s role must be resolved before any appointment or agreement.</w:t>
+        <w:t>The Founding Five is Vincent Zhang’s proposal for five founding positions at C$2 million each, toward a C$10 million ambition. His intended model includes lifetime board voting rights. These rights are not established. The legal structure, governing documents, appointment, election, removal and voting rules require independent legal review. No contribution currently purchases or guarantees a directorship or vote.</w:t>
       </w:r>
     </w:p>
     <w:p>
@@ -1547,7 +1653,7 @@
           <w:color w:val="526879"/>
           <w:sz w:val="18"/>
         </w:rPr>
-        <w:t>For a federal nonprofit corporation, director terms cannot exceed four years, although re-election is possible. This is one structure’s rule, not a determination of the legal structure Jasper should adopt. [F1]</w:t>
+        <w:t>Federal not-for-profit corporations elect directors for a term within a prescribed four-year period. Re-election may be possible; that does not establish automatic lifetime tenure. Other structures and member rights require separate advice. [F1]</w:t>
       </w:r>
     </w:p>
     <w:p>
@@ -1573,7 +1679,7 @@
     </w:p>
     <w:p>
       <w:r>
-        <w:t>Identify a capable Jasper host, appropriate educators and genuinely interested learners. Obtain current advice on the university name, programme requirements and operating structure. Gather actual venue, staffing, insurance and equipment quotes.</w:t>
+        <w:t>Confirm a responsible operator, a capable Jasper host and appropriately qualified educators. Obtain written advice and any required authorization for the name, structure, public advertising and actual activities before taking enrolments, fees or binding commitments. Gather current local quotes.</w:t>
       </w:r>
     </w:p>
     <w:p>
@@ -1586,7 +1692,7 @@
     </w:p>
     <w:p>
       <w:r>
-        <w:t>Discuss a costed in-person introductory event or the full semester with suitable supporters. A shorter event must have its own scope and must not be advertised as completion of the semester. Confirm sufficient funds and written responsibilities before committing to delivery.</w:t>
+        <w:t>Prepare a Feasibility and Host Review: named owners, written host interest, proposed staff evidence, legal and permit determinations, actual quotes and a dated go/no-go recommendation. Its budget is to be quoted. A separately scoped Jasper introductory event may follow; it is not the six-week semester.</w:t>
       </w:r>
     </w:p>
     <w:p>
@@ -1660,7 +1766,7 @@
     </w:p>
     <w:p>
       <w:r>
-        <w:t>Vision, original crest and the founding letter: Vincent Zhang. The founder identifies the recovered letter as written in 2015; the supplied document does not print that date. Its quoted sentence is reproduced exactly. The adapted welcome is new editorial language for this edition.</w:t>
+        <w:t>Vision, original crest and original welcome: Vincent Zhang. Original welcome, identified by Vincent Zhang as written in 2015; spacing normalized. Contemporary program text develops the founding purpose separately.</w:t>
       </w:r>
     </w:p>
     <w:p>
@@ -1673,7 +1779,7 @@
     </w:p>
     <w:p>
       <w:r>
-        <w:t>28 September 2026. Read this charter with the Field Semester Instructor Guide, Offline Learner Fieldbook and Founding Supporter Brief. The website is an owner-private founding preview. The official domain and application mailbox still require setup and verification.</w:t>
+        <w:t>15 October 2026. Public website: ujasper.ca. Read with the same-edition curriculum, operations manual, fieldbook and supporter brief; HTML reading editions accompany the print files. Inquiries: vincent@ujasper.ca. Formal admissions and appointments are not open.</w:t>
       </w:r>
     </w:p>
     <w:p>
@@ -1699,7 +1805,7 @@
     </w:p>
     <w:p>
       <w:r>
-        <w:t>[E1] The Academy, Programme: theacademysf.com/program. [F1] Corporations Canada, The directors: ised-isde.canada.ca/site/corporations-canada/en/not-profit-corporations/directors. [F2] Parks Canada, Jasper Recovery Framework: parks.canada.ca/pn-np/ab/jasper/gestion-management/serviceimmobilier-realty/retablissement-recovery/cadre-framework. Accessed 28 September 2026.</w:t>
+        <w:t>[E1] The Academy: theacademysf.com/program. [F1] Canada Not-for-profit Corporations Act s.128 and Regulations s.28: laws-lois.justice.gc.ca/eng/acts/C-7.75/section-128.html and laws-lois.justice.gc.ca/eng/regulations/SOR-2011-223/FullText.html. [F2] Parks Canada Jasper land-use and realty guidance. These sources inform planning; they do not approve this project.</w:t>
       </w:r>
     </w:p>
     <w:p>
@@ -1712,7 +1818,7 @@
     </w:p>
     <w:p>
       <w:r>
-        <w:t>The website’s Sources page links the institutional histories behind the declaration. The instructor guide identifies primary readings and scientific and operating references; educators must check current requirements and conditions before delivery.</w:t>
+        <w:t>The Sources page links the historical inspirations. The academic curriculum identifies primary readings, scientific data and preparation requirements. The companion manual holds operating procedures. All local delivery requirements must be checked before launch.</w:t>
       </w:r>
     </w:p>
     <w:p>
@@ -1725,7 +1831,7 @@
     </w:p>
     <w:p>
       <w:r>
-        <w:t>Morning at Spirit Island, Sergey Pesterev / Wikimedia Commons, CC BY-SA 4.0. The landscape is not an approved teaching venue or campus. Jasper Dream Crying is written by Vincent Zhang and produced by FarJasper Stories Canada; the website links to the original recording.</w:t>
+        <w:t>Morning at Spirit Island, Sergey Pesterev / Wikimedia Commons, CC BY-SA 4.0. Resized and cropped presentation retains that licence. The landscape is not an approved teaching venue or campus. Jasper Dream Crying is written by Vincent Zhang and produced by FarJasper Stories Canada; the website links to the recording.</w:t>
       </w:r>
     </w:p>
     <w:p>
@@ -1734,13 +1840,13 @@
           <w:color w:val="526879"/>
           <w:sz w:val="18"/>
         </w:rPr>
-        <w:t>The original crest is unchanged. Personal names and edition dates are separate from the institutional mark.</w:t>
+        <w:t>Original crest retained. Personal names and dates are separate from the institutional mark. The public presentation and proposed university name need current legal review; a founding-status statement is not legal clearance.</w:t>
       </w:r>
     </w:p>
     <w:sectPr>
       <w:footerReference w:type="default" r:id="rId11"/>
       <w:pgSz w:w="11905" w:h="16838"/>
-      <w:pgMar w:top="1008" w:right="1008" w:bottom="936" w:left="1008" w:header="720" w:footer="720" w:gutter="0"/>
+      <w:pgMar w:top="893" w:right="1008" w:bottom="864" w:left="1008" w:header="720" w:footer="720" w:gutter="0"/>
       <w:cols w:space="720"/>
       <w:docGrid w:linePitch="360"/>
     </w:sectPr>
@@ -1759,7 +1865,7 @@
       <w:rPr>
         <w:sz w:val="16"/>
       </w:rPr>
-      <w:t xml:space="preserve">University of Jasper  ·  </w:t>
+      <w:t xml:space="preserve">University of Jasper  |  15 October 2026  |  </w:t>
     </w:r>
     <w:fldSimple w:instr="PAGE"/>
   </w:p>
@@ -2130,12 +2236,13 @@
     <w:qFormat/>
     <w:rsid w:val="00FC693F"/>
     <w:pPr>
-      <w:spacing w:after="180" w:line="271" w:lineRule="auto"/>
+      <w:spacing w:after="160" w:line="259" w:lineRule="auto"/>
     </w:pPr>
     <w:rPr>
       <w:rFonts w:ascii="Arial" w:hAnsi="Arial"/>
       <w:color w:val="000000"/>
       <w:sz w:val="21"/>
+      <w:lang w:val="en-CA"/>
     </w:rPr>
   </w:style>
   <w:style w:type="paragraph" w:styleId="Header">
@@ -2193,15 +2300,15 @@
     <w:pPr>
       <w:keepNext/>
       <w:keepLines/>
-      <w:spacing w:before="480" w:after="180"/>
+      <w:spacing w:before="480" w:after="160"/>
       <w:outlineLvl w:val="0"/>
     </w:pPr>
     <w:rPr>
-      <w:rFonts w:cstheme="majorBidi" w:ascii="Georgia" w:hAnsi="Georgia"/>
+      <w:rFonts w:asciiTheme="majorHAnsi" w:eastAsiaTheme="majorEastAsia" w:hAnsiTheme="majorHAnsi" w:cstheme="majorBidi" w:ascii="Georgia" w:hAnsi="Georgia"/>
       <w:b w:val="0"/>
       <w:bCs/>
       <w:color w:val="000000"/>
-      <w:sz w:val="54"/>
+      <w:sz w:val="52"/>
       <w:szCs w:val="28"/>
     </w:rPr>
   </w:style>
@@ -2217,15 +2324,15 @@
     <w:pPr>
       <w:keepNext/>
       <w:keepLines/>
-      <w:spacing w:before="180" w:after="100"/>
+      <w:spacing w:before="140" w:after="80"/>
       <w:outlineLvl w:val="1"/>
     </w:pPr>
     <w:rPr>
-      <w:rFonts w:cstheme="majorBidi" w:ascii="Arial" w:hAnsi="Arial"/>
+      <w:rFonts w:asciiTheme="majorHAnsi" w:eastAsiaTheme="majorEastAsia" w:hAnsiTheme="majorHAnsi" w:cstheme="majorBidi" w:ascii="Arial" w:hAnsi="Arial"/>
       <w:b/>
       <w:bCs/>
       <w:color w:val="000000"/>
-      <w:sz w:val="23"/>
+      <w:sz w:val="22"/>
       <w:szCs w:val="26"/>
     </w:rPr>
   </w:style>
@@ -2241,14 +2348,14 @@
     <w:pPr>
       <w:keepNext/>
       <w:keepLines/>
-      <w:spacing w:before="200" w:after="180"/>
+      <w:spacing w:before="200" w:after="0"/>
       <w:outlineLvl w:val="2"/>
     </w:pPr>
     <w:rPr>
-      <w:rFonts w:asciiTheme="majorHAnsi" w:eastAsiaTheme="majorEastAsia" w:hAnsiTheme="majorHAnsi" w:cstheme="majorBidi" w:ascii="Arial" w:hAnsi="Arial"/>
+      <w:rFonts w:asciiTheme="majorHAnsi" w:eastAsiaTheme="majorEastAsia" w:hAnsiTheme="majorHAnsi" w:cstheme="majorBidi"/>
       <w:b/>
       <w:bCs/>
-      <w:color w:val="000000"/>
+      <w:color w:val="4F81BD" w:themeColor="accent1"/>
     </w:rPr>
   </w:style>
   <w:style w:type="paragraph" w:styleId="Heading4">
@@ -2479,11 +2586,11 @@
     <w:qFormat/>
     <w:rsid w:val="00FC693F"/>
     <w:pPr>
-      <w:spacing w:after="180" w:line="240" w:lineRule="auto"/>
+      <w:spacing w:after="160" w:line="240" w:lineRule="auto"/>
       <w:contextualSpacing/>
     </w:pPr>
     <w:rPr>
-      <w:rFonts w:cstheme="majorBidi" w:ascii="Georgia" w:hAnsi="Georgia"/>
+      <w:rFonts w:asciiTheme="majorHAnsi" w:eastAsiaTheme="majorEastAsia" w:hAnsiTheme="majorHAnsi" w:cstheme="majorBidi" w:ascii="Georgia" w:hAnsi="Georgia"/>
       <w:b w:val="0"/>
       <w:color w:val="000000"/>
       <w:spacing w:val="5"/>
@@ -2519,15 +2626,15 @@
       <w:numPr>
         <w:ilvl w:val="1"/>
       </w:numPr>
-      <w:spacing w:after="180"/>
+      <w:spacing w:after="160"/>
     </w:pPr>
     <w:rPr>
-      <w:rFonts w:cstheme="majorBidi" w:ascii="Arial" w:hAnsi="Arial"/>
+      <w:rFonts w:asciiTheme="majorHAnsi" w:eastAsiaTheme="majorEastAsia" w:hAnsiTheme="majorHAnsi" w:cstheme="majorBidi" w:ascii="Arial" w:hAnsi="Arial"/>
       <w:i/>
       <w:iCs/>
       <w:color w:val="000000"/>
       <w:spacing w:val="15"/>
-      <w:sz w:val="24"/>
+      <w:sz w:val="26"/>
       <w:szCs w:val="24"/>
     </w:rPr>
   </w:style>

</xml_diff>